<commit_message>
Estructura inicial del proyecto
</commit_message>
<xml_diff>
--- a/Notas y ejercicios.docx
+++ b/Notas y ejercicios.docx
@@ -207,19 +207,11 @@
           <w:rFonts w:ascii="Courier New" w:hAnsi="Courier New" w:cs="Courier New"/>
         </w:rPr>
       </w:pPr>
-      <w:proofErr w:type="gramStart"/>
-      <w:r>
-        <w:rPr>
-          <w:rFonts w:ascii="Courier New" w:hAnsi="Courier New" w:cs="Courier New"/>
-        </w:rPr>
-        <w:t>Click</w:t>
-      </w:r>
-      <w:proofErr w:type="gramEnd"/>
-      <w:r>
-        <w:rPr>
-          <w:rFonts w:ascii="Courier New" w:hAnsi="Courier New" w:cs="Courier New"/>
-        </w:rPr>
-        <w:t xml:space="preserve"> en “New </w:t>
+      <w:r>
+        <w:rPr>
+          <w:rFonts w:ascii="Courier New" w:hAnsi="Courier New" w:cs="Courier New"/>
+        </w:rPr>
+        <w:t xml:space="preserve">Click en “New </w:t>
       </w:r>
       <w:proofErr w:type="spellStart"/>
       <w:r>
@@ -612,16 +604,8 @@
         <w:rPr>
           <w:rFonts w:ascii="Courier New" w:hAnsi="Courier New" w:cs="Courier New"/>
         </w:rPr>
-        <w:t xml:space="preserve"> </w:t>
-      </w:r>
-      <w:proofErr w:type="gramStart"/>
-      <w:r>
-        <w:rPr>
-          <w:rFonts w:ascii="Courier New" w:hAnsi="Courier New" w:cs="Courier New"/>
-        </w:rPr>
-        <w:t>status</w:t>
-      </w:r>
-      <w:proofErr w:type="gramEnd"/>
+        <w:t xml:space="preserve"> status</w:t>
+      </w:r>
     </w:p>
     <w:p>
       <w:pPr>
@@ -706,14 +690,12 @@
         <w:pStyle w:val="Textosinformato"/>
         <w:rPr>
           <w:rFonts w:ascii="Courier New" w:hAnsi="Courier New" w:cs="Courier New"/>
-          <w:lang w:val="pt-BR"/>
-        </w:rPr>
-      </w:pPr>
-      <w:proofErr w:type="spellStart"/>
-      <w:r>
-        <w:rPr>
-          <w:rFonts w:ascii="Courier New" w:hAnsi="Courier New" w:cs="Courier New"/>
-          <w:lang w:val="pt-BR"/>
+        </w:rPr>
+      </w:pPr>
+      <w:proofErr w:type="spellStart"/>
+      <w:r>
+        <w:rPr>
+          <w:rFonts w:ascii="Courier New" w:hAnsi="Courier New" w:cs="Courier New"/>
         </w:rPr>
         <w:t>mkdir</w:t>
       </w:r>
@@ -721,7 +703,6 @@
       <w:r>
         <w:rPr>
           <w:rFonts w:ascii="Courier New" w:hAnsi="Courier New" w:cs="Courier New"/>
-          <w:lang w:val="pt-BR"/>
         </w:rPr>
         <w:t xml:space="preserve"> C:\temp\repo-local</w:t>
       </w:r>
@@ -731,25 +712,41 @@
         <w:pStyle w:val="Textosinformato"/>
         <w:rPr>
           <w:rFonts w:ascii="Courier New" w:hAnsi="Courier New" w:cs="Courier New"/>
-          <w:lang w:val="pt-BR"/>
-        </w:rPr>
-      </w:pPr>
-      <w:proofErr w:type="spellStart"/>
-      <w:r>
-        <w:rPr>
-          <w:rFonts w:ascii="Courier New" w:hAnsi="Courier New" w:cs="Courier New"/>
-          <w:lang w:val="pt-BR"/>
-        </w:rPr>
-        <w:t>cd</w:t>
-      </w:r>
-      <w:proofErr w:type="spellEnd"/>
-      <w:r>
-        <w:rPr>
-          <w:rFonts w:ascii="Courier New" w:hAnsi="Courier New" w:cs="Courier New"/>
-          <w:lang w:val="pt-BR"/>
-        </w:rPr>
-        <w:t xml:space="preserve"> C:\temp\repo-local</w:t>
-      </w:r>
+          <w:lang w:val="en-US"/>
+        </w:rPr>
+      </w:pPr>
+      <w:r>
+        <w:rPr>
+          <w:rFonts w:ascii="Courier New" w:hAnsi="Courier New" w:cs="Courier New"/>
+          <w:lang w:val="en-US"/>
+        </w:rPr>
+        <w:t>cd C:\temp\repo-local</w:t>
+      </w:r>
+    </w:p>
+    <w:p>
+      <w:pPr>
+        <w:pStyle w:val="Textosinformato"/>
+        <w:rPr>
+          <w:rFonts w:ascii="Courier New" w:hAnsi="Courier New" w:cs="Courier New"/>
+          <w:lang w:val="en-US"/>
+        </w:rPr>
+      </w:pPr>
+      <w:r>
+        <w:rPr>
+          <w:rFonts w:ascii="Courier New" w:hAnsi="Courier New" w:cs="Courier New"/>
+          <w:lang w:val="en-US"/>
+        </w:rPr>
+        <w:t xml:space="preserve">git </w:t>
+      </w:r>
+      <w:proofErr w:type="spellStart"/>
+      <w:r>
+        <w:rPr>
+          <w:rFonts w:ascii="Courier New" w:hAnsi="Courier New" w:cs="Courier New"/>
+          <w:lang w:val="en-US"/>
+        </w:rPr>
+        <w:t>init</w:t>
+      </w:r>
+      <w:proofErr w:type="spellEnd"/>
     </w:p>
     <w:p>
       <w:pPr>
@@ -759,83 +756,38 @@
           <w:lang w:val="fr-FR"/>
         </w:rPr>
       </w:pPr>
-      <w:proofErr w:type="gramStart"/>
       <w:r>
         <w:rPr>
           <w:rFonts w:ascii="Courier New" w:hAnsi="Courier New" w:cs="Courier New"/>
           <w:lang w:val="fr-FR"/>
         </w:rPr>
-        <w:t>git</w:t>
-      </w:r>
-      <w:proofErr w:type="gramEnd"/>
-      <w:r>
+        <w:t>git config user.name "Tu Nombre"</w:t>
+      </w:r>
+    </w:p>
+    <w:p>
+      <w:pPr>
+        <w:pStyle w:val="Textosinformato"/>
         <w:rPr>
           <w:rFonts w:ascii="Courier New" w:hAnsi="Courier New" w:cs="Courier New"/>
           <w:lang w:val="fr-FR"/>
         </w:rPr>
-        <w:t xml:space="preserve"> init</w:t>
-      </w:r>
-    </w:p>
-    <w:p>
-      <w:pPr>
-        <w:pStyle w:val="Textosinformato"/>
+      </w:pPr>
+      <w:r>
         <w:rPr>
           <w:rFonts w:ascii="Courier New" w:hAnsi="Courier New" w:cs="Courier New"/>
           <w:lang w:val="fr-FR"/>
         </w:rPr>
-      </w:pPr>
-      <w:proofErr w:type="gramStart"/>
+        <w:t xml:space="preserve">git config </w:t>
+      </w:r>
+      <w:proofErr w:type="spellStart"/>
       <w:r>
         <w:rPr>
           <w:rFonts w:ascii="Courier New" w:hAnsi="Courier New" w:cs="Courier New"/>
           <w:lang w:val="fr-FR"/>
         </w:rPr>
-        <w:t>git</w:t>
-      </w:r>
-      <w:proofErr w:type="gramEnd"/>
-      <w:r>
-        <w:rPr>
-          <w:rFonts w:ascii="Courier New" w:hAnsi="Courier New" w:cs="Courier New"/>
-          <w:lang w:val="fr-FR"/>
-        </w:rPr>
-        <w:t xml:space="preserve"> config user.name "Tu Nombre"</w:t>
-      </w:r>
-    </w:p>
-    <w:p>
-      <w:pPr>
-        <w:pStyle w:val="Textosinformato"/>
-        <w:rPr>
-          <w:rFonts w:ascii="Courier New" w:hAnsi="Courier New" w:cs="Courier New"/>
-          <w:lang w:val="fr-FR"/>
-        </w:rPr>
-      </w:pPr>
-      <w:proofErr w:type="gramStart"/>
-      <w:r>
-        <w:rPr>
-          <w:rFonts w:ascii="Courier New" w:hAnsi="Courier New" w:cs="Courier New"/>
-          <w:lang w:val="fr-FR"/>
-        </w:rPr>
-        <w:t>git</w:t>
-      </w:r>
-      <w:proofErr w:type="gramEnd"/>
-      <w:r>
-        <w:rPr>
-          <w:rFonts w:ascii="Courier New" w:hAnsi="Courier New" w:cs="Courier New"/>
-          <w:lang w:val="fr-FR"/>
-        </w:rPr>
-        <w:t xml:space="preserve"> config </w:t>
-      </w:r>
-      <w:proofErr w:type="spellStart"/>
-      <w:proofErr w:type="gramStart"/>
-      <w:r>
-        <w:rPr>
-          <w:rFonts w:ascii="Courier New" w:hAnsi="Courier New" w:cs="Courier New"/>
-          <w:lang w:val="fr-FR"/>
-        </w:rPr>
         <w:t>user.email</w:t>
       </w:r>
       <w:proofErr w:type="spellEnd"/>
-      <w:proofErr w:type="gramEnd"/>
       <w:r>
         <w:rPr>
           <w:rFonts w:ascii="Courier New" w:hAnsi="Courier New" w:cs="Courier New"/>
@@ -903,62 +855,44 @@
           <w:lang w:val="fr-FR"/>
         </w:rPr>
       </w:pPr>
-      <w:proofErr w:type="gramStart"/>
       <w:r>
         <w:rPr>
           <w:rFonts w:ascii="Courier New" w:hAnsi="Courier New" w:cs="Courier New"/>
           <w:lang w:val="fr-FR"/>
         </w:rPr>
-        <w:t>git</w:t>
-      </w:r>
-      <w:proofErr w:type="gramEnd"/>
+        <w:t xml:space="preserve">git </w:t>
+      </w:r>
+      <w:proofErr w:type="spellStart"/>
       <w:r>
         <w:rPr>
           <w:rFonts w:ascii="Courier New" w:hAnsi="Courier New" w:cs="Courier New"/>
           <w:lang w:val="fr-FR"/>
         </w:rPr>
-        <w:t xml:space="preserve"> </w:t>
-      </w:r>
-      <w:proofErr w:type="spellStart"/>
+        <w:t>add</w:t>
+      </w:r>
+      <w:proofErr w:type="spellEnd"/>
       <w:r>
         <w:rPr>
           <w:rFonts w:ascii="Courier New" w:hAnsi="Courier New" w:cs="Courier New"/>
           <w:lang w:val="fr-FR"/>
         </w:rPr>
-        <w:t>add</w:t>
-      </w:r>
-      <w:proofErr w:type="spellEnd"/>
-      <w:r>
+        <w:t xml:space="preserve"> README.md</w:t>
+      </w:r>
+    </w:p>
+    <w:p>
+      <w:pPr>
+        <w:pStyle w:val="Textosinformato"/>
         <w:rPr>
           <w:rFonts w:ascii="Courier New" w:hAnsi="Courier New" w:cs="Courier New"/>
           <w:lang w:val="fr-FR"/>
         </w:rPr>
-        <w:t xml:space="preserve"> README.md</w:t>
-      </w:r>
-    </w:p>
-    <w:p>
-      <w:pPr>
-        <w:pStyle w:val="Textosinformato"/>
+      </w:pPr>
+      <w:r>
         <w:rPr>
           <w:rFonts w:ascii="Courier New" w:hAnsi="Courier New" w:cs="Courier New"/>
           <w:lang w:val="fr-FR"/>
         </w:rPr>
-      </w:pPr>
-      <w:proofErr w:type="gramStart"/>
-      <w:r>
-        <w:rPr>
-          <w:rFonts w:ascii="Courier New" w:hAnsi="Courier New" w:cs="Courier New"/>
-          <w:lang w:val="fr-FR"/>
-        </w:rPr>
-        <w:t>git</w:t>
-      </w:r>
-      <w:proofErr w:type="gramEnd"/>
-      <w:r>
-        <w:rPr>
-          <w:rFonts w:ascii="Courier New" w:hAnsi="Courier New" w:cs="Courier New"/>
-          <w:lang w:val="fr-FR"/>
-        </w:rPr>
-        <w:t xml:space="preserve"> commit -m "Primer commit local"</w:t>
+        <w:t>git commit -m "Primer commit local"</w:t>
       </w:r>
     </w:p>
     <w:p>
@@ -1037,33 +971,69 @@
           <w:rFonts w:ascii="Courier New" w:hAnsi="Courier New" w:cs="Courier New"/>
           <w:lang w:val="en-US"/>
         </w:rPr>
-        <w:t xml:space="preserve">git </w:t>
-      </w:r>
-      <w:proofErr w:type="gramStart"/>
-      <w:r>
+        <w:t>git remote -v</w:t>
+      </w:r>
+    </w:p>
+    <w:p>
+      <w:pPr>
+        <w:pStyle w:val="Textosinformato"/>
         <w:rPr>
           <w:rFonts w:ascii="Courier New" w:hAnsi="Courier New" w:cs="Courier New"/>
           <w:lang w:val="en-US"/>
         </w:rPr>
-        <w:t>remote -v</w:t>
-      </w:r>
-      <w:proofErr w:type="gramEnd"/>
-    </w:p>
-    <w:p>
-      <w:pPr>
-        <w:pStyle w:val="Textosinformato"/>
+      </w:pPr>
+      <w:r>
         <w:rPr>
           <w:rFonts w:ascii="Courier New" w:hAnsi="Courier New" w:cs="Courier New"/>
           <w:lang w:val="en-US"/>
         </w:rPr>
-      </w:pPr>
-      <w:r>
+        <w:t>git push origin main</w:t>
+      </w:r>
+    </w:p>
+    <w:p>
+      <w:pPr>
+        <w:pStyle w:val="Textosinformato"/>
         <w:rPr>
           <w:rFonts w:ascii="Courier New" w:hAnsi="Courier New" w:cs="Courier New"/>
           <w:lang w:val="en-US"/>
         </w:rPr>
-        <w:t>git push origin main</w:t>
-      </w:r>
+      </w:pPr>
+    </w:p>
+    <w:p>
+      <w:pPr>
+        <w:pStyle w:val="Textosinformato"/>
+        <w:rPr>
+          <w:rFonts w:ascii="Courier New" w:hAnsi="Courier New" w:cs="Courier New"/>
+        </w:rPr>
+      </w:pPr>
+      <w:r>
+        <w:rPr>
+          <w:rFonts w:ascii="Courier New" w:hAnsi="Courier New" w:cs="Courier New"/>
+        </w:rPr>
+        <w:t xml:space="preserve">Si el remoto ya tiene un README distinto, Git te va a negar el </w:t>
+      </w:r>
+      <w:proofErr w:type="spellStart"/>
+      <w:r>
+        <w:rPr>
+          <w:rFonts w:ascii="Courier New" w:hAnsi="Courier New" w:cs="Courier New"/>
+        </w:rPr>
+        <w:t>push</w:t>
+      </w:r>
+      <w:proofErr w:type="spellEnd"/>
+      <w:r>
+        <w:rPr>
+          <w:rFonts w:ascii="Courier New" w:hAnsi="Courier New" w:cs="Courier New"/>
+        </w:rPr>
+        <w:t>:</w:t>
+      </w:r>
+    </w:p>
+    <w:p>
+      <w:pPr>
+        <w:pStyle w:val="Textosinformato"/>
+        <w:rPr>
+          <w:rFonts w:ascii="Courier New" w:hAnsi="Courier New" w:cs="Courier New"/>
+        </w:rPr>
+      </w:pPr>
     </w:p>
     <w:p>
       <w:pPr>
@@ -1073,73 +1043,12 @@
           <w:lang w:val="en-US"/>
         </w:rPr>
       </w:pPr>
-    </w:p>
-    <w:p>
-      <w:pPr>
-        <w:pStyle w:val="Textosinformato"/>
-        <w:rPr>
-          <w:rFonts w:ascii="Courier New" w:hAnsi="Courier New" w:cs="Courier New"/>
-        </w:rPr>
-      </w:pPr>
-      <w:r>
-        <w:rPr>
-          <w:rFonts w:ascii="Courier New" w:hAnsi="Courier New" w:cs="Courier New"/>
-        </w:rPr>
-        <w:t xml:space="preserve">Si el remoto ya tiene un README distinto, Git te va a negar el </w:t>
-      </w:r>
-      <w:proofErr w:type="spellStart"/>
-      <w:r>
-        <w:rPr>
-          <w:rFonts w:ascii="Courier New" w:hAnsi="Courier New" w:cs="Courier New"/>
-        </w:rPr>
-        <w:t>push</w:t>
-      </w:r>
-      <w:proofErr w:type="spellEnd"/>
-      <w:r>
-        <w:rPr>
-          <w:rFonts w:ascii="Courier New" w:hAnsi="Courier New" w:cs="Courier New"/>
-        </w:rPr>
-        <w:t>:</w:t>
-      </w:r>
-    </w:p>
-    <w:p>
-      <w:pPr>
-        <w:pStyle w:val="Textosinformato"/>
-        <w:rPr>
-          <w:rFonts w:ascii="Courier New" w:hAnsi="Courier New" w:cs="Courier New"/>
-        </w:rPr>
-      </w:pPr>
-    </w:p>
-    <w:p>
-      <w:pPr>
-        <w:pStyle w:val="Textosinformato"/>
+      <w:r>
         <w:rPr>
           <w:rFonts w:ascii="Courier New" w:hAnsi="Courier New" w:cs="Courier New"/>
           <w:lang w:val="en-US"/>
         </w:rPr>
-      </w:pPr>
-      <w:r>
-        <w:rPr>
-          <w:rFonts w:ascii="Courier New" w:hAnsi="Courier New" w:cs="Courier New"/>
-          <w:lang w:val="en-US"/>
-        </w:rPr>
-        <w:t>! [</w:t>
-      </w:r>
-      <w:proofErr w:type="gramStart"/>
-      <w:r>
-        <w:rPr>
-          <w:rFonts w:ascii="Courier New" w:hAnsi="Courier New" w:cs="Courier New"/>
-          <w:lang w:val="en-US"/>
-        </w:rPr>
-        <w:t xml:space="preserve">rejected]   </w:t>
-      </w:r>
-      <w:proofErr w:type="gramEnd"/>
-      <w:r>
-        <w:rPr>
-          <w:rFonts w:ascii="Courier New" w:hAnsi="Courier New" w:cs="Courier New"/>
-          <w:lang w:val="en-US"/>
-        </w:rPr>
-        <w:t xml:space="preserve">     main -&gt; main (non-fast-forward)</w:t>
+        <w:t>! [rejected]        main -&gt; main (non-fast-forward)</w:t>
       </w:r>
     </w:p>
     <w:p>
@@ -1222,23 +1131,64 @@
         <w:pStyle w:val="Textosinformato"/>
         <w:rPr>
           <w:rFonts w:ascii="Courier New" w:hAnsi="Courier New" w:cs="Courier New"/>
-          <w:lang w:val="en-US"/>
-        </w:rPr>
-      </w:pPr>
-      <w:r>
-        <w:rPr>
-          <w:rFonts w:ascii="Courier New" w:hAnsi="Courier New" w:cs="Courier New"/>
-          <w:lang w:val="en-US"/>
-        </w:rPr>
-        <w:t>git pull --rebase origin main</w:t>
-      </w:r>
-    </w:p>
-    <w:p>
-      <w:pPr>
-        <w:pStyle w:val="Textosinformato"/>
-        <w:rPr>
-          <w:rFonts w:ascii="Courier New" w:hAnsi="Courier New" w:cs="Courier New"/>
-          <w:lang w:val="en-US"/>
+        </w:rPr>
+      </w:pPr>
+      <w:proofErr w:type="spellStart"/>
+      <w:r>
+        <w:rPr>
+          <w:rFonts w:ascii="Courier New" w:hAnsi="Courier New" w:cs="Courier New"/>
+        </w:rPr>
+        <w:t>git</w:t>
+      </w:r>
+      <w:proofErr w:type="spellEnd"/>
+      <w:r>
+        <w:rPr>
+          <w:rFonts w:ascii="Courier New" w:hAnsi="Courier New" w:cs="Courier New"/>
+        </w:rPr>
+        <w:t xml:space="preserve"> </w:t>
+      </w:r>
+      <w:proofErr w:type="spellStart"/>
+      <w:r>
+        <w:rPr>
+          <w:rFonts w:ascii="Courier New" w:hAnsi="Courier New" w:cs="Courier New"/>
+        </w:rPr>
+        <w:t>pull</w:t>
+      </w:r>
+      <w:proofErr w:type="spellEnd"/>
+      <w:r>
+        <w:rPr>
+          <w:rFonts w:ascii="Courier New" w:hAnsi="Courier New" w:cs="Courier New"/>
+        </w:rPr>
+        <w:t xml:space="preserve"> --rebase </w:t>
+      </w:r>
+      <w:proofErr w:type="spellStart"/>
+      <w:r>
+        <w:rPr>
+          <w:rFonts w:ascii="Courier New" w:hAnsi="Courier New" w:cs="Courier New"/>
+        </w:rPr>
+        <w:t>origin</w:t>
+      </w:r>
+      <w:proofErr w:type="spellEnd"/>
+      <w:r>
+        <w:rPr>
+          <w:rFonts w:ascii="Courier New" w:hAnsi="Courier New" w:cs="Courier New"/>
+        </w:rPr>
+        <w:t xml:space="preserve"> </w:t>
+      </w:r>
+      <w:proofErr w:type="spellStart"/>
+      <w:r>
+        <w:rPr>
+          <w:rFonts w:ascii="Courier New" w:hAnsi="Courier New" w:cs="Courier New"/>
+        </w:rPr>
+        <w:t>main</w:t>
+      </w:r>
+      <w:proofErr w:type="spellEnd"/>
+    </w:p>
+    <w:p>
+      <w:pPr>
+        <w:pStyle w:val="Textosinformato"/>
+        <w:rPr>
+          <w:rFonts w:ascii="Courier New" w:hAnsi="Courier New" w:cs="Courier New"/>
         </w:rPr>
       </w:pPr>
     </w:p>
@@ -1284,7 +1234,6 @@
         <w:t xml:space="preserve"> </w:t>
       </w:r>
       <w:proofErr w:type="spellStart"/>
-      <w:proofErr w:type="gramStart"/>
       <w:r>
         <w:rPr>
           <w:rFonts w:ascii="Courier New" w:hAnsi="Courier New" w:cs="Courier New"/>
@@ -1298,7 +1247,6 @@
         </w:rPr>
         <w:t xml:space="preserve"> .</w:t>
       </w:r>
-      <w:proofErr w:type="gramEnd"/>
     </w:p>
     <w:p>
       <w:pPr>
@@ -1370,8 +1318,16 @@
         <w:rPr>
           <w:rFonts w:ascii="Courier New" w:hAnsi="Courier New" w:cs="Courier New"/>
         </w:rPr>
-        <w:t xml:space="preserve"> main</w:t>
-      </w:r>
+        <w:t xml:space="preserve"> </w:t>
+      </w:r>
+      <w:proofErr w:type="spellStart"/>
+      <w:r>
+        <w:rPr>
+          <w:rFonts w:ascii="Courier New" w:hAnsi="Courier New" w:cs="Courier New"/>
+        </w:rPr>
+        <w:t>main</w:t>
+      </w:r>
+      <w:proofErr w:type="spellEnd"/>
     </w:p>
     <w:p>
       <w:pPr>
@@ -1525,196 +1481,149 @@
           <w:lang w:val="fr-FR"/>
         </w:rPr>
       </w:pPr>
-      <w:proofErr w:type="gramStart"/>
       <w:r>
         <w:rPr>
           <w:rFonts w:ascii="Courier New" w:hAnsi="Courier New" w:cs="Courier New"/>
           <w:lang w:val="fr-FR"/>
         </w:rPr>
-        <w:t>git</w:t>
-      </w:r>
-      <w:proofErr w:type="gramEnd"/>
-      <w:r>
+        <w:t>git init</w:t>
+      </w:r>
+    </w:p>
+    <w:p>
+      <w:pPr>
+        <w:pStyle w:val="Textosinformato"/>
         <w:rPr>
           <w:rFonts w:ascii="Courier New" w:hAnsi="Courier New" w:cs="Courier New"/>
           <w:lang w:val="fr-FR"/>
         </w:rPr>
-        <w:t xml:space="preserve"> init</w:t>
-      </w:r>
-    </w:p>
-    <w:p>
-      <w:pPr>
-        <w:pStyle w:val="Textosinformato"/>
+      </w:pPr>
+      <w:r>
         <w:rPr>
           <w:rFonts w:ascii="Courier New" w:hAnsi="Courier New" w:cs="Courier New"/>
           <w:lang w:val="fr-FR"/>
         </w:rPr>
-      </w:pPr>
-      <w:proofErr w:type="gramStart"/>
-      <w:r>
+        <w:t>git config user.name "Tu Nombre"</w:t>
+      </w:r>
+    </w:p>
+    <w:p>
+      <w:pPr>
+        <w:pStyle w:val="Textosinformato"/>
         <w:rPr>
           <w:rFonts w:ascii="Courier New" w:hAnsi="Courier New" w:cs="Courier New"/>
           <w:lang w:val="fr-FR"/>
         </w:rPr>
-        <w:t>git</w:t>
-      </w:r>
-      <w:proofErr w:type="gramEnd"/>
+      </w:pPr>
       <w:r>
         <w:rPr>
           <w:rFonts w:ascii="Courier New" w:hAnsi="Courier New" w:cs="Courier New"/>
           <w:lang w:val="fr-FR"/>
         </w:rPr>
-        <w:t xml:space="preserve"> config user.name "Tu Nombre"</w:t>
-      </w:r>
-    </w:p>
-    <w:p>
-      <w:pPr>
-        <w:pStyle w:val="Textosinformato"/>
+        <w:t xml:space="preserve">git config </w:t>
+      </w:r>
+      <w:proofErr w:type="spellStart"/>
+      <w:r>
         <w:rPr>
           <w:rFonts w:ascii="Courier New" w:hAnsi="Courier New" w:cs="Courier New"/>
           <w:lang w:val="fr-FR"/>
         </w:rPr>
-      </w:pPr>
-      <w:proofErr w:type="gramStart"/>
+        <w:t>user.email</w:t>
+      </w:r>
+      <w:proofErr w:type="spellEnd"/>
       <w:r>
         <w:rPr>
           <w:rFonts w:ascii="Courier New" w:hAnsi="Courier New" w:cs="Courier New"/>
           <w:lang w:val="fr-FR"/>
         </w:rPr>
-        <w:t>git</w:t>
-      </w:r>
-      <w:proofErr w:type="gramEnd"/>
-      <w:r>
+        <w:t xml:space="preserve"> "tuemail@example.com"</w:t>
+      </w:r>
+    </w:p>
+    <w:p>
+      <w:pPr>
+        <w:pStyle w:val="Textosinformato"/>
         <w:rPr>
           <w:rFonts w:ascii="Courier New" w:hAnsi="Courier New" w:cs="Courier New"/>
           <w:lang w:val="fr-FR"/>
         </w:rPr>
-        <w:t xml:space="preserve"> config </w:t>
-      </w:r>
-      <w:proofErr w:type="spellStart"/>
-      <w:proofErr w:type="gramStart"/>
-      <w:r>
+      </w:pPr>
+    </w:p>
+    <w:p>
+      <w:pPr>
+        <w:pStyle w:val="Textosinformato"/>
         <w:rPr>
           <w:rFonts w:ascii="Courier New" w:hAnsi="Courier New" w:cs="Courier New"/>
           <w:lang w:val="fr-FR"/>
         </w:rPr>
-        <w:t>user.email</w:t>
-      </w:r>
-      <w:proofErr w:type="spellEnd"/>
-      <w:proofErr w:type="gramEnd"/>
+      </w:pPr>
       <w:r>
         <w:rPr>
           <w:rFonts w:ascii="Courier New" w:hAnsi="Courier New" w:cs="Courier New"/>
           <w:lang w:val="fr-FR"/>
         </w:rPr>
-        <w:t xml:space="preserve"> "tuemail@example.com"</w:t>
-      </w:r>
-    </w:p>
-    <w:p>
-      <w:pPr>
-        <w:pStyle w:val="Textosinformato"/>
+        <w:t xml:space="preserve">"## Repo local de </w:t>
+      </w:r>
+      <w:proofErr w:type="spellStart"/>
+      <w:r>
         <w:rPr>
           <w:rFonts w:ascii="Courier New" w:hAnsi="Courier New" w:cs="Courier New"/>
           <w:lang w:val="fr-FR"/>
         </w:rPr>
-      </w:pPr>
-    </w:p>
-    <w:p>
-      <w:pPr>
-        <w:pStyle w:val="Textosinformato"/>
+        <w:t>prueba</w:t>
+      </w:r>
+      <w:proofErr w:type="spellEnd"/>
+      <w:r>
         <w:rPr>
           <w:rFonts w:ascii="Courier New" w:hAnsi="Courier New" w:cs="Courier New"/>
           <w:lang w:val="fr-FR"/>
         </w:rPr>
-      </w:pPr>
-      <w:r>
+        <w:t>" | Set-Content README.md</w:t>
+      </w:r>
+    </w:p>
+    <w:p>
+      <w:pPr>
+        <w:pStyle w:val="Textosinformato"/>
         <w:rPr>
           <w:rFonts w:ascii="Courier New" w:hAnsi="Courier New" w:cs="Courier New"/>
           <w:lang w:val="fr-FR"/>
         </w:rPr>
-        <w:t xml:space="preserve">"## Repo local de </w:t>
-      </w:r>
-      <w:proofErr w:type="spellStart"/>
+      </w:pPr>
       <w:r>
         <w:rPr>
           <w:rFonts w:ascii="Courier New" w:hAnsi="Courier New" w:cs="Courier New"/>
           <w:lang w:val="fr-FR"/>
         </w:rPr>
-        <w:t>prueba</w:t>
-      </w:r>
-      <w:proofErr w:type="spellEnd"/>
+        <w:t xml:space="preserve">git </w:t>
+      </w:r>
+      <w:proofErr w:type="spellStart"/>
       <w:r>
         <w:rPr>
           <w:rFonts w:ascii="Courier New" w:hAnsi="Courier New" w:cs="Courier New"/>
           <w:lang w:val="fr-FR"/>
         </w:rPr>
-        <w:t>" | Set-Content README.md</w:t>
-      </w:r>
-    </w:p>
-    <w:p>
-      <w:pPr>
-        <w:pStyle w:val="Textosinformato"/>
+        <w:t>add</w:t>
+      </w:r>
+      <w:proofErr w:type="spellEnd"/>
+      <w:r>
         <w:rPr>
           <w:rFonts w:ascii="Courier New" w:hAnsi="Courier New" w:cs="Courier New"/>
           <w:lang w:val="fr-FR"/>
         </w:rPr>
-      </w:pPr>
-      <w:proofErr w:type="gramStart"/>
-      <w:r>
+        <w:t xml:space="preserve"> README.md</w:t>
+      </w:r>
+    </w:p>
+    <w:p>
+      <w:pPr>
+        <w:pStyle w:val="Textosinformato"/>
         <w:rPr>
           <w:rFonts w:ascii="Courier New" w:hAnsi="Courier New" w:cs="Courier New"/>
           <w:lang w:val="fr-FR"/>
         </w:rPr>
-        <w:t>git</w:t>
-      </w:r>
-      <w:proofErr w:type="gramEnd"/>
+      </w:pPr>
       <w:r>
         <w:rPr>
           <w:rFonts w:ascii="Courier New" w:hAnsi="Courier New" w:cs="Courier New"/>
           <w:lang w:val="fr-FR"/>
         </w:rPr>
-        <w:t xml:space="preserve"> </w:t>
-      </w:r>
-      <w:proofErr w:type="spellStart"/>
-      <w:r>
-        <w:rPr>
-          <w:rFonts w:ascii="Courier New" w:hAnsi="Courier New" w:cs="Courier New"/>
-          <w:lang w:val="fr-FR"/>
-        </w:rPr>
-        <w:t>add</w:t>
-      </w:r>
-      <w:proofErr w:type="spellEnd"/>
-      <w:r>
-        <w:rPr>
-          <w:rFonts w:ascii="Courier New" w:hAnsi="Courier New" w:cs="Courier New"/>
-          <w:lang w:val="fr-FR"/>
-        </w:rPr>
-        <w:t xml:space="preserve"> README.md</w:t>
-      </w:r>
-    </w:p>
-    <w:p>
-      <w:pPr>
-        <w:pStyle w:val="Textosinformato"/>
-        <w:rPr>
-          <w:rFonts w:ascii="Courier New" w:hAnsi="Courier New" w:cs="Courier New"/>
-          <w:lang w:val="fr-FR"/>
-        </w:rPr>
-      </w:pPr>
-      <w:proofErr w:type="gramStart"/>
-      <w:r>
-        <w:rPr>
-          <w:rFonts w:ascii="Courier New" w:hAnsi="Courier New" w:cs="Courier New"/>
-          <w:lang w:val="fr-FR"/>
-        </w:rPr>
-        <w:t>git</w:t>
-      </w:r>
-      <w:proofErr w:type="gramEnd"/>
-      <w:r>
-        <w:rPr>
-          <w:rFonts w:ascii="Courier New" w:hAnsi="Courier New" w:cs="Courier New"/>
-          <w:lang w:val="fr-FR"/>
-        </w:rPr>
-        <w:t xml:space="preserve"> commit -m "Primer commit local"</w:t>
+        <w:t>git commit -m "Primer commit local"</w:t>
       </w:r>
     </w:p>
     <w:p>
@@ -2257,19 +2166,11 @@
           <w:rFonts w:ascii="Courier New" w:hAnsi="Courier New" w:cs="Courier New"/>
         </w:rPr>
       </w:pPr>
-      <w:proofErr w:type="gramStart"/>
-      <w:r>
-        <w:rPr>
-          <w:rFonts w:ascii="Courier New" w:hAnsi="Courier New" w:cs="Courier New"/>
-        </w:rPr>
-        <w:t>Click</w:t>
-      </w:r>
-      <w:proofErr w:type="gramEnd"/>
-      <w:r>
-        <w:rPr>
-          <w:rFonts w:ascii="Courier New" w:hAnsi="Courier New" w:cs="Courier New"/>
-        </w:rPr>
-        <w:t xml:space="preserve"> en “New </w:t>
+      <w:r>
+        <w:rPr>
+          <w:rFonts w:ascii="Courier New" w:hAnsi="Courier New" w:cs="Courier New"/>
+        </w:rPr>
+        <w:t xml:space="preserve">Click en “New </w:t>
       </w:r>
       <w:proofErr w:type="spellStart"/>
       <w:r>
@@ -2301,21 +2202,7 @@
         <w:rPr>
           <w:rFonts w:ascii="Courier New" w:hAnsi="Courier New" w:cs="Courier New"/>
         </w:rPr>
-        <w:t xml:space="preserve">Pon nombre: por </w:t>
-      </w:r>
-      <w:proofErr w:type="gramStart"/>
-      <w:r>
-        <w:rPr>
-          <w:rFonts w:ascii="Courier New" w:hAnsi="Courier New" w:cs="Courier New"/>
-        </w:rPr>
-        <w:t>ejemplo</w:t>
-      </w:r>
-      <w:proofErr w:type="gramEnd"/>
-      <w:r>
-        <w:rPr>
-          <w:rFonts w:ascii="Courier New" w:hAnsi="Courier New" w:cs="Courier New"/>
-        </w:rPr>
-        <w:t> mi-prueba</w:t>
+        <w:t>Pon nombre: por ejemplo mi-prueba</w:t>
       </w:r>
     </w:p>
     <w:p>
@@ -2355,19 +2242,11 @@
           <w:rFonts w:ascii="Courier New" w:hAnsi="Courier New" w:cs="Courier New"/>
         </w:rPr>
       </w:pPr>
-      <w:proofErr w:type="gramStart"/>
-      <w:r>
-        <w:rPr>
-          <w:rFonts w:ascii="Courier New" w:hAnsi="Courier New" w:cs="Courier New"/>
-        </w:rPr>
-        <w:t>Click</w:t>
-      </w:r>
-      <w:proofErr w:type="gramEnd"/>
-      <w:r>
-        <w:rPr>
-          <w:rFonts w:ascii="Courier New" w:hAnsi="Courier New" w:cs="Courier New"/>
-        </w:rPr>
-        <w:t xml:space="preserve"> en “</w:t>
+      <w:r>
+        <w:rPr>
+          <w:rFonts w:ascii="Courier New" w:hAnsi="Courier New" w:cs="Courier New"/>
+        </w:rPr>
+        <w:t>Click en “</w:t>
       </w:r>
       <w:proofErr w:type="spellStart"/>
       <w:r>
@@ -2424,7 +2303,7 @@
           <w:rFonts w:ascii="Courier New" w:hAnsi="Courier New" w:cs="Courier New"/>
         </w:rPr>
         <w:pict w14:anchorId="556ACFFC">
-          <v:rect id="_x0000_i1031" style="width:0;height:1.5pt" o:hralign="center" o:hrstd="t" o:hr="t" fillcolor="#a0a0a0" stroked="f"/>
+          <v:rect id="_x0000_i1025" style="width:0;height:1.5pt" o:hralign="center" o:hrstd="t" o:hr="t" fillcolor="#a0a0a0" stroked="f"/>
         </w:pict>
       </w:r>
     </w:p>
@@ -2571,16 +2450,8 @@
         <w:rPr>
           <w:rFonts w:ascii="Courier New" w:hAnsi="Courier New" w:cs="Courier New"/>
         </w:rPr>
-        <w:t xml:space="preserve"> </w:t>
-      </w:r>
-      <w:proofErr w:type="gramStart"/>
-      <w:r>
-        <w:rPr>
-          <w:rFonts w:ascii="Courier New" w:hAnsi="Courier New" w:cs="Courier New"/>
-        </w:rPr>
-        <w:t>status</w:t>
-      </w:r>
-      <w:proofErr w:type="gramEnd"/>
+        <w:t xml:space="preserve"> status</w:t>
+      </w:r>
     </w:p>
     <w:p>
       <w:pPr>
@@ -2667,7 +2538,7 @@
           <w:rFonts w:ascii="Courier New" w:hAnsi="Courier New" w:cs="Courier New"/>
         </w:rPr>
         <w:pict w14:anchorId="20C0A2D1">
-          <v:rect id="_x0000_i1039" style="width:0;height:1.5pt" o:hralign="center" o:hrstd="t" o:hr="t" fillcolor="#a0a0a0" stroked="f"/>
+          <v:rect id="_x0000_i1026" style="width:0;height:1.5pt" o:hralign="center" o:hrstd="t" o:hr="t" fillcolor="#a0a0a0" stroked="f"/>
         </w:pict>
       </w:r>
     </w:p>
@@ -2780,8 +2651,16 @@
         <w:rPr>
           <w:rFonts w:ascii="Courier New" w:hAnsi="Courier New" w:cs="Courier New"/>
         </w:rPr>
-        <w:t xml:space="preserve"> init</w:t>
-      </w:r>
+        <w:t xml:space="preserve"> </w:t>
+      </w:r>
+      <w:proofErr w:type="spellStart"/>
+      <w:r>
+        <w:rPr>
+          <w:rFonts w:ascii="Courier New" w:hAnsi="Courier New" w:cs="Courier New"/>
+        </w:rPr>
+        <w:t>init</w:t>
+      </w:r>
+      <w:proofErr w:type="spellEnd"/>
     </w:p>
     <w:p>
       <w:pPr>
@@ -2817,7 +2696,7 @@
           <w:rFonts w:ascii="Courier New" w:hAnsi="Courier New" w:cs="Courier New"/>
         </w:rPr>
         <w:pict w14:anchorId="76783885">
-          <v:rect id="_x0000_i1047" style="width:0;height:1.5pt" o:hralign="center" o:hrstd="t" o:hr="t" fillcolor="#a0a0a0" stroked="f"/>
+          <v:rect id="_x0000_i1027" style="width:0;height:1.5pt" o:hralign="center" o:hrstd="t" o:hr="t" fillcolor="#a0a0a0" stroked="f"/>
         </w:pict>
       </w:r>
     </w:p>
@@ -2891,58 +2770,38 @@
           <w:lang w:val="fr-FR"/>
         </w:rPr>
       </w:pPr>
-      <w:proofErr w:type="gramStart"/>
       <w:r>
         <w:rPr>
           <w:rFonts w:ascii="Courier New" w:hAnsi="Courier New" w:cs="Courier New"/>
           <w:lang w:val="fr-FR"/>
         </w:rPr>
-        <w:t>git</w:t>
-      </w:r>
-      <w:proofErr w:type="gramEnd"/>
-      <w:r>
+        <w:t>git config user.name "Tu Nombre"</w:t>
+      </w:r>
+    </w:p>
+    <w:p>
+      <w:pPr>
+        <w:pStyle w:val="Textosinformato"/>
         <w:rPr>
           <w:rFonts w:ascii="Courier New" w:hAnsi="Courier New" w:cs="Courier New"/>
           <w:lang w:val="fr-FR"/>
         </w:rPr>
-        <w:t xml:space="preserve"> config user.name "Tu Nombre"</w:t>
-      </w:r>
-    </w:p>
-    <w:p>
-      <w:pPr>
-        <w:pStyle w:val="Textosinformato"/>
+      </w:pPr>
+      <w:r>
         <w:rPr>
           <w:rFonts w:ascii="Courier New" w:hAnsi="Courier New" w:cs="Courier New"/>
           <w:lang w:val="fr-FR"/>
         </w:rPr>
-      </w:pPr>
-      <w:proofErr w:type="gramStart"/>
+        <w:t xml:space="preserve">git config </w:t>
+      </w:r>
+      <w:proofErr w:type="spellStart"/>
       <w:r>
         <w:rPr>
           <w:rFonts w:ascii="Courier New" w:hAnsi="Courier New" w:cs="Courier New"/>
           <w:lang w:val="fr-FR"/>
         </w:rPr>
-        <w:t>git</w:t>
-      </w:r>
-      <w:proofErr w:type="gramEnd"/>
-      <w:r>
-        <w:rPr>
-          <w:rFonts w:ascii="Courier New" w:hAnsi="Courier New" w:cs="Courier New"/>
-          <w:lang w:val="fr-FR"/>
-        </w:rPr>
-        <w:t xml:space="preserve"> config </w:t>
-      </w:r>
-      <w:proofErr w:type="spellStart"/>
-      <w:proofErr w:type="gramStart"/>
-      <w:r>
-        <w:rPr>
-          <w:rFonts w:ascii="Courier New" w:hAnsi="Courier New" w:cs="Courier New"/>
-          <w:lang w:val="fr-FR"/>
-        </w:rPr>
         <w:t>user.email</w:t>
       </w:r>
       <w:proofErr w:type="spellEnd"/>
-      <w:proofErr w:type="gramEnd"/>
       <w:r>
         <w:rPr>
           <w:rFonts w:ascii="Courier New" w:hAnsi="Courier New" w:cs="Courier New"/>
@@ -3010,7 +2869,7 @@
           <w:rFonts w:ascii="Courier New" w:hAnsi="Courier New" w:cs="Courier New"/>
         </w:rPr>
         <w:pict w14:anchorId="44479B08">
-          <v:rect id="_x0000_i1055" style="width:0;height:1.5pt" o:hralign="center" o:hrstd="t" o:hr="t" fillcolor="#a0a0a0" stroked="f"/>
+          <v:rect id="_x0000_i1028" style="width:0;height:1.5pt" o:hralign="center" o:hrstd="t" o:hr="t" fillcolor="#a0a0a0" stroked="f"/>
         </w:pict>
       </w:r>
     </w:p>
@@ -3333,7 +3192,7 @@
           <w:rFonts w:ascii="Courier New" w:hAnsi="Courier New" w:cs="Courier New"/>
         </w:rPr>
         <w:pict w14:anchorId="748E4494">
-          <v:rect id="_x0000_i1063" style="width:0;height:1.5pt" o:hralign="center" o:hrstd="t" o:hr="t" fillcolor="#a0a0a0" stroked="f"/>
+          <v:rect id="_x0000_i1029" style="width:0;height:1.5pt" o:hralign="center" o:hrstd="t" o:hr="t" fillcolor="#a0a0a0" stroked="f"/>
         </w:pict>
       </w:r>
     </w:p>
@@ -3630,7 +3489,7 @@
           <w:rFonts w:ascii="Courier New" w:hAnsi="Courier New" w:cs="Courier New"/>
         </w:rPr>
         <w:pict w14:anchorId="16C97BC8">
-          <v:rect id="_x0000_i1071" style="width:0;height:1.5pt" o:hralign="center" o:hrstd="t" o:hr="t" fillcolor="#a0a0a0" stroked="f"/>
+          <v:rect id="_x0000_i1030" style="width:0;height:1.5pt" o:hralign="center" o:hrstd="t" o:hr="t" fillcolor="#a0a0a0" stroked="f"/>
         </w:pict>
       </w:r>
     </w:p>
@@ -4034,56 +3893,63 @@
         <w:pStyle w:val="Textosinformato"/>
         <w:rPr>
           <w:rFonts w:ascii="Courier New" w:hAnsi="Courier New" w:cs="Courier New"/>
-          <w:lang w:val="en-US"/>
-        </w:rPr>
-      </w:pPr>
-    </w:p>
-    <w:p>
-      <w:pPr>
-        <w:pStyle w:val="Textosinformato"/>
-        <w:rPr>
-          <w:rFonts w:ascii="Courier New" w:hAnsi="Courier New" w:cs="Courier New"/>
-          <w:lang w:val="en-US"/>
-        </w:rPr>
-      </w:pPr>
-      <w:r>
-        <w:rPr>
-          <w:rFonts w:ascii="Courier New" w:hAnsi="Courier New" w:cs="Courier New"/>
-          <w:lang w:val="en-US"/>
-        </w:rPr>
-        <w:t xml:space="preserve">git </w:t>
-      </w:r>
-      <w:proofErr w:type="gramStart"/>
-      <w:r>
-        <w:rPr>
-          <w:rFonts w:ascii="Courier New" w:hAnsi="Courier New" w:cs="Courier New"/>
-          <w:lang w:val="en-US"/>
-        </w:rPr>
-        <w:t>add .</w:t>
-      </w:r>
-      <w:proofErr w:type="gramEnd"/>
-    </w:p>
-    <w:p>
-      <w:pPr>
-        <w:pStyle w:val="Textosinformato"/>
-        <w:rPr>
-          <w:rFonts w:ascii="Courier New" w:hAnsi="Courier New" w:cs="Courier New"/>
-          <w:lang w:val="en-US"/>
-        </w:rPr>
-      </w:pPr>
-      <w:proofErr w:type="gramStart"/>
-      <w:r>
-        <w:rPr>
-          <w:rFonts w:ascii="Courier New" w:hAnsi="Courier New" w:cs="Courier New"/>
-          <w:lang w:val="en-US"/>
+        </w:rPr>
+      </w:pPr>
+    </w:p>
+    <w:p>
+      <w:pPr>
+        <w:pStyle w:val="Textosinformato"/>
+        <w:rPr>
+          <w:rFonts w:ascii="Courier New" w:hAnsi="Courier New" w:cs="Courier New"/>
+        </w:rPr>
+      </w:pPr>
+      <w:proofErr w:type="spellStart"/>
+      <w:r>
+        <w:rPr>
+          <w:rFonts w:ascii="Courier New" w:hAnsi="Courier New" w:cs="Courier New"/>
         </w:rPr>
         <w:t>git</w:t>
       </w:r>
-      <w:proofErr w:type="gramEnd"/>
-      <w:r>
-        <w:rPr>
-          <w:rFonts w:ascii="Courier New" w:hAnsi="Courier New" w:cs="Courier New"/>
-          <w:lang w:val="en-US"/>
+      <w:proofErr w:type="spellEnd"/>
+      <w:r>
+        <w:rPr>
+          <w:rFonts w:ascii="Courier New" w:hAnsi="Courier New" w:cs="Courier New"/>
+        </w:rPr>
+        <w:t xml:space="preserve"> </w:t>
+      </w:r>
+      <w:proofErr w:type="spellStart"/>
+      <w:r>
+        <w:rPr>
+          <w:rFonts w:ascii="Courier New" w:hAnsi="Courier New" w:cs="Courier New"/>
+        </w:rPr>
+        <w:t>add</w:t>
+      </w:r>
+      <w:proofErr w:type="spellEnd"/>
+      <w:r>
+        <w:rPr>
+          <w:rFonts w:ascii="Courier New" w:hAnsi="Courier New" w:cs="Courier New"/>
+        </w:rPr>
+        <w:t xml:space="preserve"> .</w:t>
+      </w:r>
+    </w:p>
+    <w:p>
+      <w:pPr>
+        <w:pStyle w:val="Textosinformato"/>
+        <w:rPr>
+          <w:rFonts w:ascii="Courier New" w:hAnsi="Courier New" w:cs="Courier New"/>
+        </w:rPr>
+      </w:pPr>
+      <w:proofErr w:type="spellStart"/>
+      <w:r>
+        <w:rPr>
+          <w:rFonts w:ascii="Courier New" w:hAnsi="Courier New" w:cs="Courier New"/>
+        </w:rPr>
+        <w:t>git</w:t>
+      </w:r>
+      <w:proofErr w:type="spellEnd"/>
+      <w:r>
+        <w:rPr>
+          <w:rFonts w:ascii="Courier New" w:hAnsi="Courier New" w:cs="Courier New"/>
         </w:rPr>
         <w:t xml:space="preserve"> rebase --continue</w:t>
       </w:r>
@@ -4093,23 +3959,64 @@
         <w:pStyle w:val="Textosinformato"/>
         <w:rPr>
           <w:rFonts w:ascii="Courier New" w:hAnsi="Courier New" w:cs="Courier New"/>
-          <w:lang w:val="en-US"/>
-        </w:rPr>
-      </w:pPr>
-      <w:r>
-        <w:rPr>
-          <w:rFonts w:ascii="Courier New" w:hAnsi="Courier New" w:cs="Courier New"/>
-          <w:lang w:val="en-US"/>
-        </w:rPr>
-        <w:t>git push origin main</w:t>
-      </w:r>
-    </w:p>
-    <w:p>
-      <w:pPr>
-        <w:pStyle w:val="Textosinformato"/>
-        <w:rPr>
-          <w:rFonts w:ascii="Courier New" w:hAnsi="Courier New" w:cs="Courier New"/>
-          <w:lang w:val="en-US"/>
+        </w:rPr>
+      </w:pPr>
+      <w:proofErr w:type="spellStart"/>
+      <w:r>
+        <w:rPr>
+          <w:rFonts w:ascii="Courier New" w:hAnsi="Courier New" w:cs="Courier New"/>
+        </w:rPr>
+        <w:t>git</w:t>
+      </w:r>
+      <w:proofErr w:type="spellEnd"/>
+      <w:r>
+        <w:rPr>
+          <w:rFonts w:ascii="Courier New" w:hAnsi="Courier New" w:cs="Courier New"/>
+        </w:rPr>
+        <w:t xml:space="preserve"> </w:t>
+      </w:r>
+      <w:proofErr w:type="spellStart"/>
+      <w:r>
+        <w:rPr>
+          <w:rFonts w:ascii="Courier New" w:hAnsi="Courier New" w:cs="Courier New"/>
+        </w:rPr>
+        <w:t>push</w:t>
+      </w:r>
+      <w:proofErr w:type="spellEnd"/>
+      <w:r>
+        <w:rPr>
+          <w:rFonts w:ascii="Courier New" w:hAnsi="Courier New" w:cs="Courier New"/>
+        </w:rPr>
+        <w:t xml:space="preserve"> </w:t>
+      </w:r>
+      <w:proofErr w:type="spellStart"/>
+      <w:r>
+        <w:rPr>
+          <w:rFonts w:ascii="Courier New" w:hAnsi="Courier New" w:cs="Courier New"/>
+        </w:rPr>
+        <w:t>origin</w:t>
+      </w:r>
+      <w:proofErr w:type="spellEnd"/>
+      <w:r>
+        <w:rPr>
+          <w:rFonts w:ascii="Courier New" w:hAnsi="Courier New" w:cs="Courier New"/>
+        </w:rPr>
+        <w:t xml:space="preserve"> </w:t>
+      </w:r>
+      <w:proofErr w:type="spellStart"/>
+      <w:r>
+        <w:rPr>
+          <w:rFonts w:ascii="Courier New" w:hAnsi="Courier New" w:cs="Courier New"/>
+        </w:rPr>
+        <w:t>main</w:t>
+      </w:r>
+      <w:proofErr w:type="spellEnd"/>
+    </w:p>
+    <w:p>
+      <w:pPr>
+        <w:pStyle w:val="Textosinformato"/>
+        <w:rPr>
+          <w:rFonts w:ascii="Courier New" w:hAnsi="Courier New" w:cs="Courier New"/>
         </w:rPr>
       </w:pPr>
     </w:p>
@@ -4139,7 +4046,7 @@
           <w:rFonts w:ascii="Courier New" w:hAnsi="Courier New" w:cs="Courier New"/>
         </w:rPr>
         <w:pict w14:anchorId="3F1F5F2F">
-          <v:rect id="_x0000_i1079" style="width:0;height:1.5pt" o:hralign="center" o:hrstd="t" o:hr="t" fillcolor="#a0a0a0" stroked="f"/>
+          <v:rect id="_x0000_i1031" style="width:0;height:1.5pt" o:hralign="center" o:hrstd="t" o:hr="t" fillcolor="#a0a0a0" stroked="f"/>
         </w:pict>
       </w:r>
     </w:p>
@@ -4580,196 +4487,149 @@
           <w:lang w:val="fr-FR"/>
         </w:rPr>
       </w:pPr>
-      <w:proofErr w:type="gramStart"/>
       <w:r>
         <w:rPr>
           <w:rFonts w:ascii="Courier New" w:hAnsi="Courier New" w:cs="Courier New"/>
           <w:lang w:val="fr-FR"/>
         </w:rPr>
-        <w:t>git</w:t>
-      </w:r>
-      <w:proofErr w:type="gramEnd"/>
-      <w:r>
+        <w:t>git init</w:t>
+      </w:r>
+    </w:p>
+    <w:p>
+      <w:pPr>
+        <w:pStyle w:val="Textosinformato"/>
         <w:rPr>
           <w:rFonts w:ascii="Courier New" w:hAnsi="Courier New" w:cs="Courier New"/>
           <w:lang w:val="fr-FR"/>
         </w:rPr>
-        <w:t xml:space="preserve"> init</w:t>
-      </w:r>
-    </w:p>
-    <w:p>
-      <w:pPr>
-        <w:pStyle w:val="Textosinformato"/>
+      </w:pPr>
+      <w:r>
         <w:rPr>
           <w:rFonts w:ascii="Courier New" w:hAnsi="Courier New" w:cs="Courier New"/>
           <w:lang w:val="fr-FR"/>
         </w:rPr>
-      </w:pPr>
-      <w:proofErr w:type="gramStart"/>
-      <w:r>
+        <w:t>git config user.name "Tu Nombre"</w:t>
+      </w:r>
+    </w:p>
+    <w:p>
+      <w:pPr>
+        <w:pStyle w:val="Textosinformato"/>
         <w:rPr>
           <w:rFonts w:ascii="Courier New" w:hAnsi="Courier New" w:cs="Courier New"/>
           <w:lang w:val="fr-FR"/>
         </w:rPr>
-        <w:t>git</w:t>
-      </w:r>
-      <w:proofErr w:type="gramEnd"/>
+      </w:pPr>
       <w:r>
         <w:rPr>
           <w:rFonts w:ascii="Courier New" w:hAnsi="Courier New" w:cs="Courier New"/>
           <w:lang w:val="fr-FR"/>
         </w:rPr>
-        <w:t xml:space="preserve"> config user.name "Tu Nombre"</w:t>
-      </w:r>
-    </w:p>
-    <w:p>
-      <w:pPr>
-        <w:pStyle w:val="Textosinformato"/>
+        <w:t xml:space="preserve">git config </w:t>
+      </w:r>
+      <w:proofErr w:type="spellStart"/>
+      <w:r>
         <w:rPr>
           <w:rFonts w:ascii="Courier New" w:hAnsi="Courier New" w:cs="Courier New"/>
           <w:lang w:val="fr-FR"/>
         </w:rPr>
-      </w:pPr>
-      <w:proofErr w:type="gramStart"/>
+        <w:t>user.email</w:t>
+      </w:r>
+      <w:proofErr w:type="spellEnd"/>
       <w:r>
         <w:rPr>
           <w:rFonts w:ascii="Courier New" w:hAnsi="Courier New" w:cs="Courier New"/>
           <w:lang w:val="fr-FR"/>
         </w:rPr>
-        <w:t>git</w:t>
-      </w:r>
-      <w:proofErr w:type="gramEnd"/>
-      <w:r>
+        <w:t xml:space="preserve"> "tuemail@example.com"</w:t>
+      </w:r>
+    </w:p>
+    <w:p>
+      <w:pPr>
+        <w:pStyle w:val="Textosinformato"/>
         <w:rPr>
           <w:rFonts w:ascii="Courier New" w:hAnsi="Courier New" w:cs="Courier New"/>
           <w:lang w:val="fr-FR"/>
         </w:rPr>
-        <w:t xml:space="preserve"> config </w:t>
-      </w:r>
-      <w:proofErr w:type="spellStart"/>
-      <w:proofErr w:type="gramStart"/>
-      <w:r>
+      </w:pPr>
+    </w:p>
+    <w:p>
+      <w:pPr>
+        <w:pStyle w:val="Textosinformato"/>
         <w:rPr>
           <w:rFonts w:ascii="Courier New" w:hAnsi="Courier New" w:cs="Courier New"/>
           <w:lang w:val="fr-FR"/>
         </w:rPr>
-        <w:t>user.email</w:t>
-      </w:r>
-      <w:proofErr w:type="spellEnd"/>
-      <w:proofErr w:type="gramEnd"/>
+      </w:pPr>
       <w:r>
         <w:rPr>
           <w:rFonts w:ascii="Courier New" w:hAnsi="Courier New" w:cs="Courier New"/>
           <w:lang w:val="fr-FR"/>
         </w:rPr>
-        <w:t xml:space="preserve"> "tuemail@example.com"</w:t>
-      </w:r>
-    </w:p>
-    <w:p>
-      <w:pPr>
-        <w:pStyle w:val="Textosinformato"/>
+        <w:t xml:space="preserve">"## Repo local de </w:t>
+      </w:r>
+      <w:proofErr w:type="spellStart"/>
+      <w:r>
         <w:rPr>
           <w:rFonts w:ascii="Courier New" w:hAnsi="Courier New" w:cs="Courier New"/>
           <w:lang w:val="fr-FR"/>
         </w:rPr>
-      </w:pPr>
-    </w:p>
-    <w:p>
-      <w:pPr>
-        <w:pStyle w:val="Textosinformato"/>
+        <w:t>prueba</w:t>
+      </w:r>
+      <w:proofErr w:type="spellEnd"/>
+      <w:r>
         <w:rPr>
           <w:rFonts w:ascii="Courier New" w:hAnsi="Courier New" w:cs="Courier New"/>
           <w:lang w:val="fr-FR"/>
         </w:rPr>
-      </w:pPr>
-      <w:r>
+        <w:t>" | Set-Content README.md</w:t>
+      </w:r>
+    </w:p>
+    <w:p>
+      <w:pPr>
+        <w:pStyle w:val="Textosinformato"/>
         <w:rPr>
           <w:rFonts w:ascii="Courier New" w:hAnsi="Courier New" w:cs="Courier New"/>
           <w:lang w:val="fr-FR"/>
         </w:rPr>
-        <w:t xml:space="preserve">"## Repo local de </w:t>
-      </w:r>
-      <w:proofErr w:type="spellStart"/>
+      </w:pPr>
       <w:r>
         <w:rPr>
           <w:rFonts w:ascii="Courier New" w:hAnsi="Courier New" w:cs="Courier New"/>
           <w:lang w:val="fr-FR"/>
         </w:rPr>
-        <w:t>prueba</w:t>
-      </w:r>
-      <w:proofErr w:type="spellEnd"/>
+        <w:t xml:space="preserve">git </w:t>
+      </w:r>
+      <w:proofErr w:type="spellStart"/>
       <w:r>
         <w:rPr>
           <w:rFonts w:ascii="Courier New" w:hAnsi="Courier New" w:cs="Courier New"/>
           <w:lang w:val="fr-FR"/>
         </w:rPr>
-        <w:t>" | Set-Content README.md</w:t>
-      </w:r>
-    </w:p>
-    <w:p>
-      <w:pPr>
-        <w:pStyle w:val="Textosinformato"/>
+        <w:t>add</w:t>
+      </w:r>
+      <w:proofErr w:type="spellEnd"/>
+      <w:r>
         <w:rPr>
           <w:rFonts w:ascii="Courier New" w:hAnsi="Courier New" w:cs="Courier New"/>
           <w:lang w:val="fr-FR"/>
         </w:rPr>
-      </w:pPr>
-      <w:proofErr w:type="gramStart"/>
-      <w:r>
+        <w:t xml:space="preserve"> README.md</w:t>
+      </w:r>
+    </w:p>
+    <w:p>
+      <w:pPr>
+        <w:pStyle w:val="Textosinformato"/>
         <w:rPr>
           <w:rFonts w:ascii="Courier New" w:hAnsi="Courier New" w:cs="Courier New"/>
           <w:lang w:val="fr-FR"/>
         </w:rPr>
-        <w:t>git</w:t>
-      </w:r>
-      <w:proofErr w:type="gramEnd"/>
+      </w:pPr>
       <w:r>
         <w:rPr>
           <w:rFonts w:ascii="Courier New" w:hAnsi="Courier New" w:cs="Courier New"/>
           <w:lang w:val="fr-FR"/>
         </w:rPr>
-        <w:t xml:space="preserve"> </w:t>
-      </w:r>
-      <w:proofErr w:type="spellStart"/>
-      <w:r>
-        <w:rPr>
-          <w:rFonts w:ascii="Courier New" w:hAnsi="Courier New" w:cs="Courier New"/>
-          <w:lang w:val="fr-FR"/>
-        </w:rPr>
-        <w:t>add</w:t>
-      </w:r>
-      <w:proofErr w:type="spellEnd"/>
-      <w:r>
-        <w:rPr>
-          <w:rFonts w:ascii="Courier New" w:hAnsi="Courier New" w:cs="Courier New"/>
-          <w:lang w:val="fr-FR"/>
-        </w:rPr>
-        <w:t xml:space="preserve"> README.md</w:t>
-      </w:r>
-    </w:p>
-    <w:p>
-      <w:pPr>
-        <w:pStyle w:val="Textosinformato"/>
-        <w:rPr>
-          <w:rFonts w:ascii="Courier New" w:hAnsi="Courier New" w:cs="Courier New"/>
-          <w:lang w:val="fr-FR"/>
-        </w:rPr>
-      </w:pPr>
-      <w:proofErr w:type="gramStart"/>
-      <w:r>
-        <w:rPr>
-          <w:rFonts w:ascii="Courier New" w:hAnsi="Courier New" w:cs="Courier New"/>
-          <w:lang w:val="fr-FR"/>
-        </w:rPr>
-        <w:t>git</w:t>
-      </w:r>
-      <w:proofErr w:type="gramEnd"/>
-      <w:r>
-        <w:rPr>
-          <w:rFonts w:ascii="Courier New" w:hAnsi="Courier New" w:cs="Courier New"/>
-          <w:lang w:val="fr-FR"/>
-        </w:rPr>
-        <w:t xml:space="preserve"> commit -m "Primer commit local"</w:t>
+        <w:t>git commit -m "Primer commit local"</w:t>
       </w:r>
     </w:p>
     <w:p>
@@ -5212,6 +5072,890 @@
           <w:rFonts w:ascii="Courier New" w:hAnsi="Courier New" w:cs="Courier New"/>
         </w:rPr>
       </w:pPr>
+    </w:p>
+    <w:p>
+      <w:pPr>
+        <w:pStyle w:val="Textosinformato"/>
+        <w:rPr>
+          <w:rFonts w:ascii="Courier New" w:hAnsi="Courier New" w:cs="Courier New"/>
+        </w:rPr>
+      </w:pPr>
+    </w:p>
+    <w:p>
+      <w:pPr>
+        <w:pStyle w:val="Textosinformato"/>
+        <w:rPr>
+          <w:rFonts w:ascii="Courier New" w:hAnsi="Courier New" w:cs="Courier New"/>
+        </w:rPr>
+      </w:pPr>
+      <w:proofErr w:type="spellStart"/>
+      <w:r>
+        <w:rPr>
+          <w:rFonts w:ascii="Courier New" w:hAnsi="Courier New" w:cs="Courier New"/>
+        </w:rPr>
+        <w:t>Situacion</w:t>
+      </w:r>
+      <w:proofErr w:type="spellEnd"/>
+      <w:r>
+        <w:rPr>
+          <w:rFonts w:ascii="Courier New" w:hAnsi="Courier New" w:cs="Courier New"/>
+        </w:rPr>
+        <w:t xml:space="preserve"> Dos:</w:t>
+      </w:r>
+    </w:p>
+    <w:p>
+      <w:pPr>
+        <w:pStyle w:val="Textosinformato"/>
+        <w:rPr>
+          <w:rFonts w:ascii="Courier New" w:hAnsi="Courier New" w:cs="Courier New"/>
+        </w:rPr>
+      </w:pPr>
+    </w:p>
+    <w:p>
+      <w:pPr>
+        <w:pStyle w:val="Textosinformato"/>
+        <w:rPr>
+          <w:rFonts w:ascii="Courier New" w:hAnsi="Courier New" w:cs="Courier New"/>
+        </w:rPr>
+      </w:pPr>
+      <w:r>
+        <w:rPr>
+          <w:rFonts w:ascii="Courier New" w:hAnsi="Courier New" w:cs="Courier New"/>
+        </w:rPr>
+        <w:t xml:space="preserve">1. Crear una carpeta </w:t>
+      </w:r>
+      <w:proofErr w:type="spellStart"/>
+      <w:r>
+        <w:rPr>
+          <w:rFonts w:ascii="Courier New" w:hAnsi="Courier New" w:cs="Courier New"/>
+        </w:rPr>
+        <w:t>datos_prueba</w:t>
+      </w:r>
+      <w:proofErr w:type="spellEnd"/>
+      <w:r>
+        <w:rPr>
+          <w:rFonts w:ascii="Courier New" w:hAnsi="Courier New" w:cs="Courier New"/>
+        </w:rPr>
+        <w:t xml:space="preserve"> con un archivo adentro. </w:t>
+      </w:r>
+    </w:p>
+    <w:p>
+      <w:pPr>
+        <w:pStyle w:val="Textosinformato"/>
+        <w:rPr>
+          <w:rFonts w:ascii="Courier New" w:hAnsi="Courier New" w:cs="Courier New"/>
+          <w:lang w:val="en-US"/>
+        </w:rPr>
+      </w:pPr>
+      <w:r>
+        <w:rPr>
+          <w:rFonts w:ascii="Courier New" w:hAnsi="Courier New" w:cs="Courier New"/>
+          <w:lang w:val="en-US"/>
+        </w:rPr>
+        <w:t xml:space="preserve">2. git add ., git commit, git push — SIN </w:t>
+      </w:r>
+      <w:proofErr w:type="spellStart"/>
+      <w:r>
+        <w:rPr>
+          <w:rFonts w:ascii="Courier New" w:hAnsi="Courier New" w:cs="Courier New"/>
+          <w:lang w:val="en-US"/>
+        </w:rPr>
+        <w:t>agregarla</w:t>
+      </w:r>
+      <w:proofErr w:type="spellEnd"/>
+      <w:r>
+        <w:rPr>
+          <w:rFonts w:ascii="Courier New" w:hAnsi="Courier New" w:cs="Courier New"/>
+          <w:lang w:val="en-US"/>
+        </w:rPr>
+        <w:t xml:space="preserve"> al .</w:t>
+      </w:r>
+      <w:proofErr w:type="spellStart"/>
+      <w:r>
+        <w:rPr>
+          <w:rFonts w:ascii="Courier New" w:hAnsi="Courier New" w:cs="Courier New"/>
+          <w:lang w:val="en-US"/>
+        </w:rPr>
+        <w:t>gitignore</w:t>
+      </w:r>
+      <w:proofErr w:type="spellEnd"/>
+      <w:r>
+        <w:rPr>
+          <w:rFonts w:ascii="Courier New" w:hAnsi="Courier New" w:cs="Courier New"/>
+          <w:lang w:val="en-US"/>
+        </w:rPr>
+        <w:t xml:space="preserve">. </w:t>
+      </w:r>
+    </w:p>
+    <w:p>
+      <w:pPr>
+        <w:pStyle w:val="Textosinformato"/>
+        <w:rPr>
+          <w:rFonts w:ascii="Courier New" w:hAnsi="Courier New" w:cs="Courier New"/>
+        </w:rPr>
+      </w:pPr>
+      <w:r>
+        <w:rPr>
+          <w:rFonts w:ascii="Courier New" w:hAnsi="Courier New" w:cs="Courier New"/>
+        </w:rPr>
+        <w:t>3. Confirmar en GitHub que subió</w:t>
+      </w:r>
+    </w:p>
+    <w:p>
+      <w:pPr>
+        <w:pStyle w:val="Textosinformato"/>
+        <w:rPr>
+          <w:rFonts w:ascii="Courier New" w:hAnsi="Courier New" w:cs="Courier New"/>
+        </w:rPr>
+      </w:pPr>
+    </w:p>
+    <w:p>
+      <w:pPr>
+        <w:pStyle w:val="Textosinformato"/>
+        <w:rPr>
+          <w:rFonts w:ascii="Courier New" w:hAnsi="Courier New" w:cs="Courier New"/>
+        </w:rPr>
+      </w:pPr>
+      <w:proofErr w:type="spellStart"/>
+      <w:r>
+        <w:rPr>
+          <w:rFonts w:ascii="Courier New" w:hAnsi="Courier New" w:cs="Courier New"/>
+        </w:rPr>
+        <w:t>Solucion</w:t>
+      </w:r>
+      <w:proofErr w:type="spellEnd"/>
+      <w:r>
+        <w:rPr>
+          <w:rFonts w:ascii="Courier New" w:hAnsi="Courier New" w:cs="Courier New"/>
+        </w:rPr>
+        <w:t>:</w:t>
+      </w:r>
+    </w:p>
+    <w:p>
+      <w:pPr>
+        <w:pStyle w:val="Textosinformato"/>
+        <w:rPr>
+          <w:rFonts w:ascii="Courier New" w:hAnsi="Courier New" w:cs="Courier New"/>
+        </w:rPr>
+      </w:pPr>
+    </w:p>
+    <w:p>
+      <w:pPr>
+        <w:pStyle w:val="Textosinformato"/>
+        <w:rPr>
+          <w:rFonts w:ascii="Courier New" w:hAnsi="Courier New" w:cs="Courier New"/>
+        </w:rPr>
+      </w:pPr>
+      <w:proofErr w:type="spellStart"/>
+      <w:r>
+        <w:rPr>
+          <w:rFonts w:ascii="Courier New" w:hAnsi="Courier New" w:cs="Courier New"/>
+        </w:rPr>
+        <w:t>git</w:t>
+      </w:r>
+      <w:proofErr w:type="spellEnd"/>
+      <w:r>
+        <w:rPr>
+          <w:rFonts w:ascii="Courier New" w:hAnsi="Courier New" w:cs="Courier New"/>
+        </w:rPr>
+        <w:t xml:space="preserve"> </w:t>
+      </w:r>
+      <w:proofErr w:type="spellStart"/>
+      <w:r>
+        <w:rPr>
+          <w:rFonts w:ascii="Courier New" w:hAnsi="Courier New" w:cs="Courier New"/>
+        </w:rPr>
+        <w:t>rm</w:t>
+      </w:r>
+      <w:proofErr w:type="spellEnd"/>
+      <w:r>
+        <w:rPr>
+          <w:rFonts w:ascii="Courier New" w:hAnsi="Courier New" w:cs="Courier New"/>
+        </w:rPr>
+        <w:t xml:space="preserve"> -r --</w:t>
+      </w:r>
+      <w:proofErr w:type="spellStart"/>
+      <w:r>
+        <w:rPr>
+          <w:rFonts w:ascii="Courier New" w:hAnsi="Courier New" w:cs="Courier New"/>
+        </w:rPr>
+        <w:t>cached</w:t>
+      </w:r>
+      <w:proofErr w:type="spellEnd"/>
+      <w:r>
+        <w:rPr>
+          <w:rFonts w:ascii="Courier New" w:hAnsi="Courier New" w:cs="Courier New"/>
+        </w:rPr>
+        <w:t xml:space="preserve"> </w:t>
+      </w:r>
+      <w:proofErr w:type="spellStart"/>
+      <w:r>
+        <w:rPr>
+          <w:rFonts w:ascii="Courier New" w:hAnsi="Courier New" w:cs="Courier New"/>
+        </w:rPr>
+        <w:t>datos_prueba</w:t>
+      </w:r>
+      <w:proofErr w:type="spellEnd"/>
+      <w:r>
+        <w:rPr>
+          <w:rFonts w:ascii="Courier New" w:hAnsi="Courier New" w:cs="Courier New"/>
+        </w:rPr>
+        <w:t xml:space="preserve"> </w:t>
+      </w:r>
+    </w:p>
+    <w:p>
+      <w:pPr>
+        <w:pStyle w:val="Textosinformato"/>
+        <w:rPr>
+          <w:rFonts w:ascii="Courier New" w:hAnsi="Courier New" w:cs="Courier New"/>
+        </w:rPr>
+      </w:pPr>
+      <w:proofErr w:type="spellStart"/>
+      <w:r>
+        <w:rPr>
+          <w:rFonts w:ascii="Courier New" w:hAnsi="Courier New" w:cs="Courier New"/>
+        </w:rPr>
+        <w:t>git</w:t>
+      </w:r>
+      <w:proofErr w:type="spellEnd"/>
+      <w:r>
+        <w:rPr>
+          <w:rFonts w:ascii="Courier New" w:hAnsi="Courier New" w:cs="Courier New"/>
+        </w:rPr>
+        <w:t xml:space="preserve"> </w:t>
+      </w:r>
+      <w:proofErr w:type="spellStart"/>
+      <w:r>
+        <w:rPr>
+          <w:rFonts w:ascii="Courier New" w:hAnsi="Courier New" w:cs="Courier New"/>
+        </w:rPr>
+        <w:t>commit</w:t>
+      </w:r>
+      <w:proofErr w:type="spellEnd"/>
+      <w:r>
+        <w:rPr>
+          <w:rFonts w:ascii="Courier New" w:hAnsi="Courier New" w:cs="Courier New"/>
+        </w:rPr>
+        <w:t xml:space="preserve"> -m "dejar de </w:t>
+      </w:r>
+      <w:proofErr w:type="spellStart"/>
+      <w:r>
+        <w:rPr>
+          <w:rFonts w:ascii="Courier New" w:hAnsi="Courier New" w:cs="Courier New"/>
+        </w:rPr>
+        <w:t>trackear</w:t>
+      </w:r>
+      <w:proofErr w:type="spellEnd"/>
+      <w:r>
+        <w:rPr>
+          <w:rFonts w:ascii="Courier New" w:hAnsi="Courier New" w:cs="Courier New"/>
+        </w:rPr>
+        <w:t xml:space="preserve"> </w:t>
+      </w:r>
+      <w:proofErr w:type="spellStart"/>
+      <w:r>
+        <w:rPr>
+          <w:rFonts w:ascii="Courier New" w:hAnsi="Courier New" w:cs="Courier New"/>
+        </w:rPr>
+        <w:t>datos_prueba</w:t>
+      </w:r>
+      <w:proofErr w:type="spellEnd"/>
+      <w:r>
+        <w:rPr>
+          <w:rFonts w:ascii="Courier New" w:hAnsi="Courier New" w:cs="Courier New"/>
+        </w:rPr>
+        <w:t xml:space="preserve">" </w:t>
+      </w:r>
+    </w:p>
+    <w:p>
+      <w:pPr>
+        <w:pStyle w:val="Textosinformato"/>
+        <w:rPr>
+          <w:rFonts w:ascii="Courier New" w:hAnsi="Courier New" w:cs="Courier New"/>
+        </w:rPr>
+      </w:pPr>
+      <w:proofErr w:type="spellStart"/>
+      <w:r>
+        <w:rPr>
+          <w:rFonts w:ascii="Courier New" w:hAnsi="Courier New" w:cs="Courier New"/>
+        </w:rPr>
+        <w:t>git</w:t>
+      </w:r>
+      <w:proofErr w:type="spellEnd"/>
+      <w:r>
+        <w:rPr>
+          <w:rFonts w:ascii="Courier New" w:hAnsi="Courier New" w:cs="Courier New"/>
+        </w:rPr>
+        <w:t xml:space="preserve"> </w:t>
+      </w:r>
+      <w:proofErr w:type="spellStart"/>
+      <w:r>
+        <w:rPr>
+          <w:rFonts w:ascii="Courier New" w:hAnsi="Courier New" w:cs="Courier New"/>
+        </w:rPr>
+        <w:t>push</w:t>
+      </w:r>
+      <w:proofErr w:type="spellEnd"/>
+      <w:r>
+        <w:rPr>
+          <w:rFonts w:ascii="Courier New" w:hAnsi="Courier New" w:cs="Courier New"/>
+        </w:rPr>
+        <w:t xml:space="preserve"> </w:t>
+      </w:r>
+    </w:p>
+    <w:p>
+      <w:pPr>
+        <w:pStyle w:val="Textosinformato"/>
+        <w:rPr>
+          <w:rFonts w:ascii="Courier New" w:hAnsi="Courier New" w:cs="Courier New"/>
+        </w:rPr>
+      </w:pPr>
+      <w:r>
+        <w:rPr>
+          <w:rFonts w:ascii="Courier New" w:hAnsi="Courier New" w:cs="Courier New"/>
+        </w:rPr>
+        <w:t xml:space="preserve"># recién ahora agregar </w:t>
+      </w:r>
+      <w:proofErr w:type="spellStart"/>
+      <w:r>
+        <w:rPr>
+          <w:rFonts w:ascii="Courier New" w:hAnsi="Courier New" w:cs="Courier New"/>
+        </w:rPr>
+        <w:t>datos_prueba</w:t>
+      </w:r>
+      <w:proofErr w:type="spellEnd"/>
+      <w:r>
+        <w:rPr>
+          <w:rFonts w:ascii="Courier New" w:hAnsi="Courier New" w:cs="Courier New"/>
+        </w:rPr>
+        <w:t>/ al .</w:t>
+      </w:r>
+      <w:proofErr w:type="spellStart"/>
+      <w:r>
+        <w:rPr>
+          <w:rFonts w:ascii="Courier New" w:hAnsi="Courier New" w:cs="Courier New"/>
+        </w:rPr>
+        <w:t>gitignore</w:t>
+      </w:r>
+      <w:proofErr w:type="spellEnd"/>
+      <w:r>
+        <w:rPr>
+          <w:rFonts w:ascii="Courier New" w:hAnsi="Courier New" w:cs="Courier New"/>
+        </w:rPr>
+        <w:t>, para que no vuelva a pasar</w:t>
+      </w:r>
+      <w:r>
+        <w:rPr>
+          <w:rFonts w:ascii="Courier New" w:hAnsi="Courier New" w:cs="Courier New"/>
+        </w:rPr>
+        <w:t>.</w:t>
+      </w:r>
+    </w:p>
+    <w:p>
+      <w:pPr>
+        <w:pStyle w:val="Textosinformato"/>
+        <w:rPr>
+          <w:rFonts w:ascii="Courier New" w:hAnsi="Courier New" w:cs="Courier New"/>
+        </w:rPr>
+      </w:pPr>
+    </w:p>
+    <w:p>
+      <w:pPr>
+        <w:pStyle w:val="Textosinformato"/>
+        <w:rPr>
+          <w:rFonts w:ascii="Courier New" w:hAnsi="Courier New" w:cs="Courier New"/>
+        </w:rPr>
+      </w:pPr>
+      <w:r>
+        <w:rPr>
+          <w:rFonts w:ascii="Courier New" w:hAnsi="Courier New" w:cs="Courier New"/>
+        </w:rPr>
+        <w:t>Ejercicio 3</w:t>
+      </w:r>
+    </w:p>
+    <w:p>
+      <w:pPr>
+        <w:pStyle w:val="Textosinformato"/>
+        <w:rPr>
+          <w:rFonts w:ascii="Courier New" w:hAnsi="Courier New" w:cs="Courier New"/>
+        </w:rPr>
+      </w:pPr>
+    </w:p>
+    <w:p>
+      <w:pPr>
+        <w:pStyle w:val="Textosinformato"/>
+        <w:rPr>
+          <w:rFonts w:ascii="Courier New" w:hAnsi="Courier New" w:cs="Courier New"/>
+        </w:rPr>
+      </w:pPr>
+      <w:r>
+        <w:rPr>
+          <w:rFonts w:ascii="Courier New" w:hAnsi="Courier New" w:cs="Courier New"/>
+        </w:rPr>
+        <w:t xml:space="preserve">1. </w:t>
+      </w:r>
+      <w:proofErr w:type="spellStart"/>
+      <w:r>
+        <w:rPr>
+          <w:rFonts w:ascii="Courier New" w:hAnsi="Courier New" w:cs="Courier New"/>
+        </w:rPr>
+        <w:t>git</w:t>
+      </w:r>
+      <w:proofErr w:type="spellEnd"/>
+      <w:r>
+        <w:rPr>
+          <w:rFonts w:ascii="Courier New" w:hAnsi="Courier New" w:cs="Courier New"/>
+        </w:rPr>
+        <w:t xml:space="preserve"> </w:t>
+      </w:r>
+      <w:proofErr w:type="spellStart"/>
+      <w:r>
+        <w:rPr>
+          <w:rFonts w:ascii="Courier New" w:hAnsi="Courier New" w:cs="Courier New"/>
+        </w:rPr>
+        <w:t>config</w:t>
+      </w:r>
+      <w:proofErr w:type="spellEnd"/>
+      <w:r>
+        <w:rPr>
+          <w:rFonts w:ascii="Courier New" w:hAnsi="Courier New" w:cs="Courier New"/>
+        </w:rPr>
+        <w:t xml:space="preserve"> --global </w:t>
+      </w:r>
+      <w:proofErr w:type="spellStart"/>
+      <w:r>
+        <w:rPr>
+          <w:rFonts w:ascii="Courier New" w:hAnsi="Courier New" w:cs="Courier New"/>
+        </w:rPr>
+        <w:t>init.defaultBranch</w:t>
+      </w:r>
+      <w:proofErr w:type="spellEnd"/>
+      <w:r>
+        <w:rPr>
+          <w:rFonts w:ascii="Courier New" w:hAnsi="Courier New" w:cs="Courier New"/>
+        </w:rPr>
+        <w:t xml:space="preserve"> master (solo para este ejercicio). </w:t>
+      </w:r>
+    </w:p>
+    <w:p>
+      <w:pPr>
+        <w:pStyle w:val="Textosinformato"/>
+        <w:rPr>
+          <w:rFonts w:ascii="Courier New" w:hAnsi="Courier New" w:cs="Courier New"/>
+        </w:rPr>
+      </w:pPr>
+      <w:r>
+        <w:rPr>
+          <w:rFonts w:ascii="Courier New" w:hAnsi="Courier New" w:cs="Courier New"/>
+        </w:rPr>
+        <w:t xml:space="preserve">2. Crear un repo local nuevo con </w:t>
+      </w:r>
+      <w:proofErr w:type="spellStart"/>
+      <w:r>
+        <w:rPr>
+          <w:rFonts w:ascii="Courier New" w:hAnsi="Courier New" w:cs="Courier New"/>
+        </w:rPr>
+        <w:t>git</w:t>
+      </w:r>
+      <w:proofErr w:type="spellEnd"/>
+      <w:r>
+        <w:rPr>
+          <w:rFonts w:ascii="Courier New" w:hAnsi="Courier New" w:cs="Courier New"/>
+        </w:rPr>
+        <w:t xml:space="preserve"> </w:t>
+      </w:r>
+      <w:proofErr w:type="spellStart"/>
+      <w:r>
+        <w:rPr>
+          <w:rFonts w:ascii="Courier New" w:hAnsi="Courier New" w:cs="Courier New"/>
+        </w:rPr>
+        <w:t>init</w:t>
+      </w:r>
+      <w:proofErr w:type="spellEnd"/>
+      <w:r>
+        <w:rPr>
+          <w:rFonts w:ascii="Courier New" w:hAnsi="Courier New" w:cs="Courier New"/>
+        </w:rPr>
+        <w:t xml:space="preserve"> y un </w:t>
+      </w:r>
+      <w:proofErr w:type="spellStart"/>
+      <w:r>
+        <w:rPr>
+          <w:rFonts w:ascii="Courier New" w:hAnsi="Courier New" w:cs="Courier New"/>
+        </w:rPr>
+        <w:t>commit</w:t>
+      </w:r>
+      <w:proofErr w:type="spellEnd"/>
+      <w:r>
+        <w:rPr>
+          <w:rFonts w:ascii="Courier New" w:hAnsi="Courier New" w:cs="Courier New"/>
+        </w:rPr>
+        <w:t xml:space="preserve"> inicial. </w:t>
+      </w:r>
+    </w:p>
+    <w:p>
+      <w:pPr>
+        <w:pStyle w:val="Textosinformato"/>
+        <w:rPr>
+          <w:rFonts w:ascii="Courier New" w:hAnsi="Courier New" w:cs="Courier New"/>
+        </w:rPr>
+      </w:pPr>
+      <w:r>
+        <w:rPr>
+          <w:rFonts w:ascii="Courier New" w:hAnsi="Courier New" w:cs="Courier New"/>
+        </w:rPr>
+        <w:t xml:space="preserve">3. Crear en GitHub un repo vacío (usa </w:t>
+      </w:r>
+      <w:proofErr w:type="spellStart"/>
+      <w:r>
+        <w:rPr>
+          <w:rFonts w:ascii="Courier New" w:hAnsi="Courier New" w:cs="Courier New"/>
+        </w:rPr>
+        <w:t>main</w:t>
+      </w:r>
+      <w:proofErr w:type="spellEnd"/>
+      <w:r>
+        <w:rPr>
+          <w:rFonts w:ascii="Courier New" w:hAnsi="Courier New" w:cs="Courier New"/>
+        </w:rPr>
+        <w:t xml:space="preserve"> por defecto) y conectarlo. </w:t>
+      </w:r>
+    </w:p>
+    <w:p>
+      <w:pPr>
+        <w:pStyle w:val="Textosinformato"/>
+        <w:rPr>
+          <w:rFonts w:ascii="Courier New" w:hAnsi="Courier New" w:cs="Courier New"/>
+        </w:rPr>
+      </w:pPr>
+      <w:r>
+        <w:rPr>
+          <w:rFonts w:ascii="Courier New" w:hAnsi="Courier New" w:cs="Courier New"/>
+        </w:rPr>
+        <w:t>4. gi</w:t>
+      </w:r>
+      <w:proofErr w:type="spellStart"/>
+      <w:r>
+        <w:rPr>
+          <w:rFonts w:ascii="Courier New" w:hAnsi="Courier New" w:cs="Courier New"/>
+        </w:rPr>
+        <w:t>t</w:t>
+      </w:r>
+      <w:proofErr w:type="spellEnd"/>
+      <w:r>
+        <w:rPr>
+          <w:rFonts w:ascii="Courier New" w:hAnsi="Courier New" w:cs="Courier New"/>
+        </w:rPr>
+        <w:t xml:space="preserve"> </w:t>
+      </w:r>
+      <w:proofErr w:type="spellStart"/>
+      <w:r>
+        <w:rPr>
+          <w:rFonts w:ascii="Courier New" w:hAnsi="Courier New" w:cs="Courier New"/>
+        </w:rPr>
+        <w:t>push</w:t>
+      </w:r>
+      <w:proofErr w:type="spellEnd"/>
+      <w:r>
+        <w:rPr>
+          <w:rFonts w:ascii="Courier New" w:hAnsi="Courier New" w:cs="Courier New"/>
+        </w:rPr>
+        <w:t xml:space="preserve"> -u </w:t>
+      </w:r>
+      <w:proofErr w:type="spellStart"/>
+      <w:r>
+        <w:rPr>
+          <w:rFonts w:ascii="Courier New" w:hAnsi="Courier New" w:cs="Courier New"/>
+        </w:rPr>
+        <w:t>origin</w:t>
+      </w:r>
+      <w:proofErr w:type="spellEnd"/>
+      <w:r>
+        <w:rPr>
+          <w:rFonts w:ascii="Courier New" w:hAnsi="Courier New" w:cs="Courier New"/>
+        </w:rPr>
+        <w:t xml:space="preserve"> master</w:t>
+      </w:r>
+    </w:p>
+    <w:p>
+      <w:pPr>
+        <w:pStyle w:val="Textosinformato"/>
+        <w:rPr>
+          <w:rFonts w:ascii="Courier New" w:hAnsi="Courier New" w:cs="Courier New"/>
+        </w:rPr>
+      </w:pPr>
+    </w:p>
+    <w:p>
+      <w:pPr>
+        <w:pStyle w:val="Textosinformato"/>
+        <w:rPr>
+          <w:rFonts w:ascii="Courier New" w:hAnsi="Courier New" w:cs="Courier New"/>
+        </w:rPr>
+      </w:pPr>
+      <w:proofErr w:type="spellStart"/>
+      <w:r>
+        <w:rPr>
+          <w:rFonts w:ascii="Courier New" w:hAnsi="Courier New" w:cs="Courier New"/>
+        </w:rPr>
+        <w:t>Solucion</w:t>
+      </w:r>
+      <w:proofErr w:type="spellEnd"/>
+      <w:r>
+        <w:rPr>
+          <w:rFonts w:ascii="Courier New" w:hAnsi="Courier New" w:cs="Courier New"/>
+        </w:rPr>
+        <w:t>:</w:t>
+      </w:r>
+    </w:p>
+    <w:p>
+      <w:pPr>
+        <w:pStyle w:val="Textosinformato"/>
+        <w:rPr>
+          <w:rFonts w:ascii="Courier New" w:hAnsi="Courier New" w:cs="Courier New"/>
+        </w:rPr>
+      </w:pPr>
+    </w:p>
+    <w:p>
+      <w:pPr>
+        <w:pStyle w:val="Textosinformato"/>
+        <w:rPr>
+          <w:rFonts w:ascii="Courier New" w:hAnsi="Courier New" w:cs="Courier New"/>
+        </w:rPr>
+      </w:pPr>
+      <w:proofErr w:type="spellStart"/>
+      <w:r>
+        <w:rPr>
+          <w:rFonts w:ascii="Courier New" w:hAnsi="Courier New" w:cs="Courier New"/>
+        </w:rPr>
+        <w:t>git</w:t>
+      </w:r>
+      <w:proofErr w:type="spellEnd"/>
+      <w:r>
+        <w:rPr>
+          <w:rFonts w:ascii="Courier New" w:hAnsi="Courier New" w:cs="Courier New"/>
+        </w:rPr>
+        <w:t xml:space="preserve"> </w:t>
+      </w:r>
+      <w:proofErr w:type="spellStart"/>
+      <w:r>
+        <w:rPr>
+          <w:rFonts w:ascii="Courier New" w:hAnsi="Courier New" w:cs="Courier New"/>
+        </w:rPr>
+        <w:t>branch</w:t>
+      </w:r>
+      <w:proofErr w:type="spellEnd"/>
+      <w:r>
+        <w:rPr>
+          <w:rFonts w:ascii="Courier New" w:hAnsi="Courier New" w:cs="Courier New"/>
+        </w:rPr>
+        <w:t xml:space="preserve"> -m master </w:t>
+      </w:r>
+      <w:proofErr w:type="spellStart"/>
+      <w:r>
+        <w:rPr>
+          <w:rFonts w:ascii="Courier New" w:hAnsi="Courier New" w:cs="Courier New"/>
+        </w:rPr>
+        <w:t>main</w:t>
+      </w:r>
+      <w:proofErr w:type="spellEnd"/>
+      <w:r>
+        <w:rPr>
+          <w:rFonts w:ascii="Courier New" w:hAnsi="Courier New" w:cs="Courier New"/>
+        </w:rPr>
+        <w:t xml:space="preserve"> </w:t>
+      </w:r>
+    </w:p>
+    <w:p>
+      <w:pPr>
+        <w:pStyle w:val="Textosinformato"/>
+        <w:rPr>
+          <w:rFonts w:ascii="Courier New" w:hAnsi="Courier New" w:cs="Courier New"/>
+        </w:rPr>
+      </w:pPr>
+      <w:proofErr w:type="spellStart"/>
+      <w:r>
+        <w:rPr>
+          <w:rFonts w:ascii="Courier New" w:hAnsi="Courier New" w:cs="Courier New"/>
+        </w:rPr>
+        <w:t>git</w:t>
+      </w:r>
+      <w:proofErr w:type="spellEnd"/>
+      <w:r>
+        <w:rPr>
+          <w:rFonts w:ascii="Courier New" w:hAnsi="Courier New" w:cs="Courier New"/>
+        </w:rPr>
+        <w:t xml:space="preserve"> </w:t>
+      </w:r>
+      <w:proofErr w:type="spellStart"/>
+      <w:r>
+        <w:rPr>
+          <w:rFonts w:ascii="Courier New" w:hAnsi="Courier New" w:cs="Courier New"/>
+        </w:rPr>
+        <w:t>push</w:t>
+      </w:r>
+      <w:proofErr w:type="spellEnd"/>
+      <w:r>
+        <w:rPr>
+          <w:rFonts w:ascii="Courier New" w:hAnsi="Courier New" w:cs="Courier New"/>
+        </w:rPr>
+        <w:t xml:space="preserve"> -u </w:t>
+      </w:r>
+      <w:proofErr w:type="spellStart"/>
+      <w:r>
+        <w:rPr>
+          <w:rFonts w:ascii="Courier New" w:hAnsi="Courier New" w:cs="Courier New"/>
+        </w:rPr>
+        <w:t>origin</w:t>
+      </w:r>
+      <w:proofErr w:type="spellEnd"/>
+      <w:r>
+        <w:rPr>
+          <w:rFonts w:ascii="Courier New" w:hAnsi="Courier New" w:cs="Courier New"/>
+        </w:rPr>
+        <w:t xml:space="preserve"> </w:t>
+      </w:r>
+      <w:proofErr w:type="spellStart"/>
+      <w:r>
+        <w:rPr>
+          <w:rFonts w:ascii="Courier New" w:hAnsi="Courier New" w:cs="Courier New"/>
+        </w:rPr>
+        <w:t>main</w:t>
+      </w:r>
+      <w:proofErr w:type="spellEnd"/>
+      <w:r>
+        <w:rPr>
+          <w:rFonts w:ascii="Courier New" w:hAnsi="Courier New" w:cs="Courier New"/>
+        </w:rPr>
+        <w:t xml:space="preserve"> </w:t>
+      </w:r>
+    </w:p>
+    <w:p>
+      <w:pPr>
+        <w:pStyle w:val="Textosinformato"/>
+        <w:rPr>
+          <w:rFonts w:ascii="Courier New" w:hAnsi="Courier New" w:cs="Courier New"/>
+        </w:rPr>
+      </w:pPr>
+      <w:proofErr w:type="spellStart"/>
+      <w:r>
+        <w:rPr>
+          <w:rFonts w:ascii="Courier New" w:hAnsi="Courier New" w:cs="Courier New"/>
+        </w:rPr>
+        <w:t>git</w:t>
+      </w:r>
+      <w:proofErr w:type="spellEnd"/>
+      <w:r>
+        <w:rPr>
+          <w:rFonts w:ascii="Courier New" w:hAnsi="Courier New" w:cs="Courier New"/>
+        </w:rPr>
+        <w:t xml:space="preserve"> </w:t>
+      </w:r>
+      <w:proofErr w:type="spellStart"/>
+      <w:r>
+        <w:rPr>
+          <w:rFonts w:ascii="Courier New" w:hAnsi="Courier New" w:cs="Courier New"/>
+        </w:rPr>
+        <w:t>push</w:t>
+      </w:r>
+      <w:proofErr w:type="spellEnd"/>
+      <w:r>
+        <w:rPr>
+          <w:rFonts w:ascii="Courier New" w:hAnsi="Courier New" w:cs="Courier New"/>
+        </w:rPr>
+        <w:t xml:space="preserve"> </w:t>
+      </w:r>
+      <w:proofErr w:type="spellStart"/>
+      <w:r>
+        <w:rPr>
+          <w:rFonts w:ascii="Courier New" w:hAnsi="Courier New" w:cs="Courier New"/>
+        </w:rPr>
+        <w:t>origin</w:t>
+      </w:r>
+      <w:proofErr w:type="spellEnd"/>
+      <w:r>
+        <w:rPr>
+          <w:rFonts w:ascii="Courier New" w:hAnsi="Courier New" w:cs="Courier New"/>
+        </w:rPr>
+        <w:t xml:space="preserve"> --</w:t>
+      </w:r>
+      <w:proofErr w:type="spellStart"/>
+      <w:r>
+        <w:rPr>
+          <w:rFonts w:ascii="Courier New" w:hAnsi="Courier New" w:cs="Courier New"/>
+        </w:rPr>
+        <w:t>delete</w:t>
+      </w:r>
+      <w:proofErr w:type="spellEnd"/>
+      <w:r>
+        <w:rPr>
+          <w:rFonts w:ascii="Courier New" w:hAnsi="Courier New" w:cs="Courier New"/>
+        </w:rPr>
+        <w:t xml:space="preserve"> master </w:t>
+      </w:r>
+    </w:p>
+    <w:p>
+      <w:pPr>
+        <w:pStyle w:val="Textosinformato"/>
+        <w:rPr>
+          <w:rFonts w:ascii="Courier New" w:hAnsi="Courier New" w:cs="Courier New"/>
+        </w:rPr>
+      </w:pPr>
+      <w:proofErr w:type="spellStart"/>
+      <w:r>
+        <w:rPr>
+          <w:rFonts w:ascii="Courier New" w:hAnsi="Courier New" w:cs="Courier New"/>
+        </w:rPr>
+        <w:t>git</w:t>
+      </w:r>
+      <w:proofErr w:type="spellEnd"/>
+      <w:r>
+        <w:rPr>
+          <w:rFonts w:ascii="Courier New" w:hAnsi="Courier New" w:cs="Courier New"/>
+        </w:rPr>
+        <w:t xml:space="preserve"> </w:t>
+      </w:r>
+      <w:proofErr w:type="spellStart"/>
+      <w:r>
+        <w:rPr>
+          <w:rFonts w:ascii="Courier New" w:hAnsi="Courier New" w:cs="Courier New"/>
+        </w:rPr>
+        <w:t>config</w:t>
+      </w:r>
+      <w:proofErr w:type="spellEnd"/>
+      <w:r>
+        <w:rPr>
+          <w:rFonts w:ascii="Courier New" w:hAnsi="Courier New" w:cs="Courier New"/>
+        </w:rPr>
+        <w:t xml:space="preserve"> --global </w:t>
+      </w:r>
+      <w:proofErr w:type="spellStart"/>
+      <w:r>
+        <w:rPr>
+          <w:rFonts w:ascii="Courier New" w:hAnsi="Courier New" w:cs="Courier New"/>
+        </w:rPr>
+        <w:t>init.defaultBranch</w:t>
+      </w:r>
+      <w:proofErr w:type="spellEnd"/>
+      <w:r>
+        <w:rPr>
+          <w:rFonts w:ascii="Courier New" w:hAnsi="Courier New" w:cs="Courier New"/>
+        </w:rPr>
+        <w:t xml:space="preserve"> </w:t>
+      </w:r>
+      <w:proofErr w:type="spellStart"/>
+      <w:r>
+        <w:rPr>
+          <w:rFonts w:ascii="Courier New" w:hAnsi="Courier New" w:cs="Courier New"/>
+        </w:rPr>
+        <w:t>main</w:t>
+      </w:r>
+      <w:proofErr w:type="spellEnd"/>
+      <w:r>
+        <w:rPr>
+          <w:rFonts w:ascii="Courier New" w:hAnsi="Courier New" w:cs="Courier New"/>
+        </w:rPr>
+        <w:t xml:space="preserve"> # para que no vuelva a pasar</w:t>
+      </w:r>
     </w:p>
     <w:p>
       <w:pPr>

</xml_diff>